<commit_message>
Update Instruction for the Car Kit.docx
</commit_message>
<xml_diff>
--- a/MaUWB_AOA Gen2  4WD Auto-following Robot Platform/Instruction for the Car Kit.docx
+++ b/MaUWB_AOA Gen2  4WD Auto-following Robot Platform/Instruction for the Car Kit.docx
@@ -437,16 +437,16 @@
           <w:rFonts w:hint="eastAsia"/>
           <w:lang w:val="en-US" w:eastAsia="zh-CN"/>
         </w:rPr>
-        <w:t>4.Bind the corresponding tag.</w:t>
+        <w:t>4.Unbind tag</w:t>
       </w:r>
     </w:p>
     <w:p>
       <w:r>
         <w:drawing>
           <wp:inline distT="0" distB="0" distL="114300" distR="114300">
-            <wp:extent cx="5265420" cy="5085080"/>
-            <wp:effectExtent l="0" t="0" r="1905" b="1270"/>
-            <wp:docPr id="6" name="图片 3"/>
+            <wp:extent cx="5267325" cy="3923030"/>
+            <wp:effectExtent l="0" t="0" r="0" b="1270"/>
+            <wp:docPr id="13" name="图片 1"/>
             <wp:cNvGraphicFramePr>
               <a:graphicFrameLocks xmlns:a="http://schemas.openxmlformats.org/drawingml/2006/main" noChangeAspect="1"/>
             </wp:cNvGraphicFramePr>
@@ -454,7 +454,7 @@
               <a:graphicData uri="http://schemas.openxmlformats.org/drawingml/2006/picture">
                 <pic:pic xmlns:pic="http://schemas.openxmlformats.org/drawingml/2006/picture">
                   <pic:nvPicPr>
-                    <pic:cNvPr id="6" name="图片 3"/>
+                    <pic:cNvPr id="13" name="图片 1"/>
                     <pic:cNvPicPr>
                       <a:picLocks noChangeAspect="1"/>
                     </pic:cNvPicPr>
@@ -468,7 +468,7 @@
                   <pic:spPr>
                     <a:xfrm>
                       <a:off x="0" y="0"/>
-                      <a:ext cx="5265420" cy="5085080"/>
+                      <a:ext cx="5267325" cy="3923030"/>
                     </a:xfrm>
                     <a:prstGeom prst="rect">
                       <a:avLst/>
@@ -488,6 +488,7 @@
     <w:p>
       <w:pPr>
         <w:rPr>
+          <w:rFonts w:hint="eastAsia"/>
           <w:color w:val="E54C5E" w:themeColor="accent6"/>
           <w14:textFill>
             <w14:solidFill>
@@ -509,29 +510,51 @@
         <w:t>Note: If a user has multiple tags, they need to switch between tags. First, the original tags must be unbound before new tags can be bound.</w:t>
       </w:r>
     </w:p>
+    <w:p>
+      <w:pPr>
+        <w:rPr>
+          <w:rFonts w:hint="default" w:eastAsiaTheme="minorEastAsia"/>
+          <w:color w:val="E54C5E" w:themeColor="accent6"/>
+          <w:lang w:val="en-US" w:eastAsia="zh-CN"/>
+          <w14:textFill>
+            <w14:solidFill>
+              <w14:schemeClr w14:val="accent6"/>
+            </w14:solidFill>
+          </w14:textFill>
+        </w:rPr>
+      </w:pPr>
+    </w:p>
+    <w:p>
+      <w:pPr>
+        <w:rPr>
+          <w:rFonts w:hint="eastAsia"/>
+          <w:lang w:val="en-US" w:eastAsia="zh-CN"/>
+        </w:rPr>
+      </w:pPr>
+      <w:r>
+        <w:rPr>
+          <w:rFonts w:hint="eastAsia"/>
+          <w:color w:val="auto"/>
+          <w:lang w:val="en-US" w:eastAsia="zh-CN"/>
+        </w:rPr>
+        <w:t>5.</w:t>
+      </w:r>
+      <w:r>
+        <w:rPr>
+          <w:rFonts w:hint="eastAsia"/>
+          <w:lang w:val="en-US" w:eastAsia="zh-CN"/>
+        </w:rPr>
+        <w:t>Bind the corresponding tag.</w:t>
+      </w:r>
+    </w:p>
     <w:p/>
-    <w:p>
-      <w:pPr>
-        <w:rPr>
-          <w:rFonts w:hint="eastAsia"/>
-          <w:lang w:val="en-US" w:eastAsia="zh-CN"/>
-        </w:rPr>
-      </w:pPr>
-      <w:r>
-        <w:rPr>
-          <w:rFonts w:hint="eastAsia"/>
-          <w:lang w:val="en-US" w:eastAsia="zh-CN"/>
-        </w:rPr>
-        <w:t>5.After binding, you can check if the binding was successful. Click the remote control button to view the remote control status display.</w:t>
-      </w:r>
-    </w:p>
     <w:p>
       <w:r>
         <w:drawing>
           <wp:inline distT="0" distB="0" distL="114300" distR="114300">
             <wp:extent cx="5265420" cy="5085080"/>
             <wp:effectExtent l="0" t="0" r="1905" b="1270"/>
-            <wp:docPr id="7" name="图片 4"/>
+            <wp:docPr id="12" name="图片 3"/>
             <wp:cNvGraphicFramePr>
               <a:graphicFrameLocks xmlns:a="http://schemas.openxmlformats.org/drawingml/2006/main" noChangeAspect="1"/>
             </wp:cNvGraphicFramePr>
@@ -539,7 +562,7 @@
               <a:graphicData uri="http://schemas.openxmlformats.org/drawingml/2006/picture">
                 <pic:pic xmlns:pic="http://schemas.openxmlformats.org/drawingml/2006/picture">
                   <pic:nvPicPr>
-                    <pic:cNvPr id="7" name="图片 4"/>
+                    <pic:cNvPr id="12" name="图片 3"/>
                     <pic:cNvPicPr>
                       <a:picLocks noChangeAspect="1"/>
                     </pic:cNvPicPr>
@@ -570,21 +593,40 @@
         </w:drawing>
       </w:r>
     </w:p>
+    <w:p>
+      <w:pPr>
+        <w:rPr>
+          <w:rFonts w:hint="default"/>
+          <w:lang w:val="en-US" w:eastAsia="zh-CN"/>
+        </w:rPr>
+      </w:pPr>
+      <w:r>
+        <w:rPr>
+          <w:rFonts w:hint="eastAsia"/>
+          <w:color w:val="E54C5E" w:themeColor="accent6"/>
+          <w14:textFill>
+            <w14:solidFill>
+              <w14:schemeClr w14:val="accent6"/>
+            </w14:solidFill>
+          </w14:textFill>
+        </w:rPr>
+        <w:t>Note: If a user has multiple tags, they need to switch between tags. First, the original tags must be unbound before new tags can be bound.</w:t>
+      </w:r>
+    </w:p>
     <w:p/>
-    <w:p/>
-    <w:p>
-      <w:pPr>
-        <w:rPr>
-          <w:rFonts w:hint="eastAsia"/>
-          <w:lang w:val="en-US" w:eastAsia="zh-CN"/>
-        </w:rPr>
-      </w:pPr>
-      <w:r>
-        <w:rPr>
-          <w:rFonts w:hint="eastAsia"/>
-          <w:lang w:val="en-US" w:eastAsia="zh-CN"/>
-        </w:rPr>
-        <w:t>6.The angle waveform diagram shows.</w:t>
+    <w:p>
+      <w:pPr>
+        <w:rPr>
+          <w:rFonts w:hint="eastAsia"/>
+          <w:lang w:val="en-US" w:eastAsia="zh-CN"/>
+        </w:rPr>
+      </w:pPr>
+      <w:r>
+        <w:rPr>
+          <w:rFonts w:hint="eastAsia"/>
+          <w:lang w:val="en-US" w:eastAsia="zh-CN"/>
+        </w:rPr>
+        <w:t>6.After binding, you can check if the binding was successful. Click the remote control button to view the remote control status display.</w:t>
       </w:r>
     </w:p>
     <w:p>
@@ -593,7 +635,7 @@
           <wp:inline distT="0" distB="0" distL="114300" distR="114300">
             <wp:extent cx="5265420" cy="5085080"/>
             <wp:effectExtent l="0" t="0" r="1905" b="1270"/>
-            <wp:docPr id="8" name="图片 5"/>
+            <wp:docPr id="7" name="图片 4"/>
             <wp:cNvGraphicFramePr>
               <a:graphicFrameLocks xmlns:a="http://schemas.openxmlformats.org/drawingml/2006/main" noChangeAspect="1"/>
             </wp:cNvGraphicFramePr>
@@ -601,7 +643,7 @@
               <a:graphicData uri="http://schemas.openxmlformats.org/drawingml/2006/picture">
                 <pic:pic xmlns:pic="http://schemas.openxmlformats.org/drawingml/2006/picture">
                   <pic:nvPicPr>
-                    <pic:cNvPr id="8" name="图片 5"/>
+                    <pic:cNvPr id="7" name="图片 4"/>
                     <pic:cNvPicPr>
                       <a:picLocks noChangeAspect="1"/>
                     </pic:cNvPicPr>
@@ -633,33 +675,20 @@
       </w:r>
     </w:p>
     <w:p/>
-    <w:p>
-      <w:pPr>
-        <w:rPr>
-          <w:rFonts w:hint="eastAsia"/>
-          <w:lang w:val="en-US" w:eastAsia="zh-CN"/>
-        </w:rPr>
-      </w:pPr>
-      <w:r>
-        <w:rPr>
-          <w:rFonts w:hint="eastAsia"/>
-          <w:lang w:val="en-US" w:eastAsia="zh-CN"/>
-        </w:rPr>
-        <w:t>7.</w:t>
-      </w:r>
-      <w:r>
-        <w:rPr>
-          <w:rFonts w:hint="default"/>
-          <w:lang w:val="en-US" w:eastAsia="zh-CN"/>
-        </w:rPr>
-        <w:t>Base station configuration</w:t>
-      </w:r>
-      <w:r>
-        <w:rPr>
-          <w:rFonts w:hint="eastAsia"/>
-          <w:lang w:val="en-US" w:eastAsia="zh-CN"/>
-        </w:rPr>
-        <w:t>.</w:t>
+    <w:p/>
+    <w:p>
+      <w:pPr>
+        <w:rPr>
+          <w:rFonts w:hint="eastAsia"/>
+          <w:lang w:val="en-US" w:eastAsia="zh-CN"/>
+        </w:rPr>
+      </w:pPr>
+      <w:r>
+        <w:rPr>
+          <w:rFonts w:hint="eastAsia"/>
+          <w:lang w:val="en-US" w:eastAsia="zh-CN"/>
+        </w:rPr>
+        <w:t>7.The angle waveform diagram shows.</w:t>
       </w:r>
     </w:p>
     <w:p>
@@ -668,7 +697,7 @@
           <wp:inline distT="0" distB="0" distL="114300" distR="114300">
             <wp:extent cx="5265420" cy="5085080"/>
             <wp:effectExtent l="0" t="0" r="1905" b="1270"/>
-            <wp:docPr id="9" name="图片 6"/>
+            <wp:docPr id="8" name="图片 5"/>
             <wp:cNvGraphicFramePr>
               <a:graphicFrameLocks xmlns:a="http://schemas.openxmlformats.org/drawingml/2006/main" noChangeAspect="1"/>
             </wp:cNvGraphicFramePr>
@@ -676,7 +705,7 @@
               <a:graphicData uri="http://schemas.openxmlformats.org/drawingml/2006/picture">
                 <pic:pic xmlns:pic="http://schemas.openxmlformats.org/drawingml/2006/picture">
                   <pic:nvPicPr>
-                    <pic:cNvPr id="9" name="图片 6"/>
+                    <pic:cNvPr id="8" name="图片 5"/>
                     <pic:cNvPicPr>
                       <a:picLocks noChangeAspect="1"/>
                     </pic:cNvPicPr>
@@ -707,388 +736,52 @@
         </w:drawing>
       </w:r>
     </w:p>
-    <w:p>
-      <w:pPr>
-        <w:rPr>
-          <w:rFonts w:hint="default"/>
-          <w:lang w:val="en-US" w:eastAsia="zh-CN"/>
-        </w:rPr>
-      </w:pPr>
-      <w:r>
-        <w:rPr>
-          <w:rFonts w:hint="default"/>
-          <w:lang w:val="en-US" w:eastAsia="zh-CN"/>
-        </w:rPr>
-        <w:t>Parameter Description:</w:t>
-      </w:r>
-    </w:p>
-    <w:p>
-      <w:pPr>
-        <w:rPr>
-          <w:rFonts w:hint="default"/>
-          <w:lang w:val="en-US" w:eastAsia="zh-CN"/>
-        </w:rPr>
-      </w:pPr>
-      <w:r>
-        <w:rPr>
-          <w:rFonts w:hint="default"/>
-          <w:lang w:val="en-US" w:eastAsia="zh-CN"/>
-        </w:rPr>
-        <w:t>[Device Parameters]</w:t>
-      </w:r>
-    </w:p>
-    <w:p>
-      <w:pPr>
-        <w:rPr>
-          <w:rFonts w:hint="default"/>
-          <w:lang w:val="en-US" w:eastAsia="zh-CN"/>
-        </w:rPr>
-      </w:pPr>
-      <w:r>
-        <w:rPr>
-          <w:rFonts w:hint="default"/>
-          <w:lang w:val="en-US" w:eastAsia="zh-CN"/>
-        </w:rPr>
-        <w:t>Base Station Network</w:t>
-      </w:r>
-      <w:r>
-        <w:rPr>
-          <w:rFonts w:hint="eastAsia"/>
-          <w:lang w:val="en-US" w:eastAsia="zh-CN"/>
-        </w:rPr>
-        <w:t>(1)</w:t>
-      </w:r>
-      <w:r>
-        <w:rPr>
-          <w:rFonts w:hint="default"/>
-          <w:lang w:val="en-US" w:eastAsia="zh-CN"/>
-        </w:rPr>
-        <w:t>: Network ID (This parameter can be used to set the network ID and the base station number ID to avoid interference between multiple sets)</w:t>
-      </w:r>
-    </w:p>
-    <w:p>
-      <w:pPr>
-        <w:rPr>
-          <w:rFonts w:hint="default"/>
-          <w:lang w:val="en-US" w:eastAsia="zh-CN"/>
-        </w:rPr>
-      </w:pPr>
-      <w:r>
-        <w:rPr>
-          <w:rFonts w:hint="default"/>
-          <w:lang w:val="en-US" w:eastAsia="zh-CN"/>
-        </w:rPr>
-        <w:t>Base Station Role</w:t>
-      </w:r>
-      <w:r>
-        <w:rPr>
-          <w:rFonts w:hint="eastAsia"/>
-          <w:lang w:val="en-US" w:eastAsia="zh-CN"/>
-        </w:rPr>
-        <w:t>(2)</w:t>
-      </w:r>
-      <w:r>
-        <w:rPr>
-          <w:rFonts w:hint="default"/>
-          <w:lang w:val="en-US" w:eastAsia="zh-CN"/>
-        </w:rPr>
-        <w:t>: Default</w:t>
-      </w:r>
-    </w:p>
-    <w:p>
-      <w:pPr>
-        <w:rPr>
-          <w:rFonts w:hint="default"/>
-          <w:lang w:val="en-US" w:eastAsia="zh-CN"/>
-        </w:rPr>
-      </w:pPr>
-      <w:r>
-        <w:rPr>
-          <w:rFonts w:hint="default"/>
-          <w:lang w:val="en-US" w:eastAsia="zh-CN"/>
-        </w:rPr>
-        <w:t>Base Station Number ID</w:t>
-      </w:r>
-      <w:r>
-        <w:rPr>
-          <w:rFonts w:hint="eastAsia"/>
-          <w:lang w:val="en-US" w:eastAsia="zh-CN"/>
-        </w:rPr>
-        <w:t>(3)</w:t>
-      </w:r>
-      <w:r>
-        <w:rPr>
-          <w:rFonts w:hint="default"/>
-          <w:lang w:val="en-US" w:eastAsia="zh-CN"/>
-        </w:rPr>
-        <w:t>: Tags within the same network ID can communicate with different base station number IDs. Each base station can obtain distance and angle</w:t>
-      </w:r>
-    </w:p>
-    <w:p>
-      <w:pPr>
-        <w:rPr>
-          <w:rFonts w:hint="default"/>
-          <w:lang w:val="en-US" w:eastAsia="zh-CN"/>
-        </w:rPr>
-      </w:pPr>
-      <w:r>
-        <w:rPr>
-          <w:rFonts w:hint="default"/>
-          <w:lang w:val="en-US" w:eastAsia="zh-CN"/>
-        </w:rPr>
-        <w:t>Number of Base Station Binding Tags</w:t>
-      </w:r>
-      <w:r>
-        <w:rPr>
-          <w:rFonts w:hint="eastAsia"/>
-          <w:lang w:val="en-US" w:eastAsia="zh-CN"/>
-        </w:rPr>
-        <w:t>(4)</w:t>
-      </w:r>
-      <w:r>
-        <w:rPr>
-          <w:rFonts w:hint="default"/>
-          <w:lang w:val="en-US" w:eastAsia="zh-CN"/>
-        </w:rPr>
-        <w:t>: Default</w:t>
-      </w:r>
-    </w:p>
-    <w:p>
-      <w:pPr>
-        <w:rPr>
-          <w:rFonts w:hint="default"/>
-          <w:lang w:val="en-US" w:eastAsia="zh-CN"/>
-        </w:rPr>
-      </w:pPr>
-      <w:r>
-        <w:rPr>
-          <w:rFonts w:hint="default"/>
-          <w:lang w:val="en-US" w:eastAsia="zh-CN"/>
-        </w:rPr>
-        <w:t>Base Station Single Cycle Duration (ms)</w:t>
-      </w:r>
-      <w:r>
-        <w:rPr>
-          <w:rFonts w:hint="eastAsia"/>
-          <w:lang w:val="en-US" w:eastAsia="zh-CN"/>
-        </w:rPr>
-        <w:t>(5)</w:t>
-      </w:r>
-      <w:r>
-        <w:rPr>
-          <w:rFonts w:hint="default"/>
-          <w:lang w:val="en-US" w:eastAsia="zh-CN"/>
-        </w:rPr>
-        <w:t>: The duration of communication between the tag and the base station</w:t>
-      </w:r>
-    </w:p>
-    <w:p>
-      <w:pPr>
-        <w:rPr>
-          <w:rFonts w:hint="default"/>
-          <w:lang w:val="en-US" w:eastAsia="zh-CN"/>
-        </w:rPr>
-      </w:pPr>
-      <w:r>
-        <w:rPr>
-          <w:rFonts w:hint="default"/>
-          <w:lang w:val="en-US" w:eastAsia="zh-CN"/>
-        </w:rPr>
-        <w:t>Base Station Command Format</w:t>
-      </w:r>
-      <w:r>
-        <w:rPr>
-          <w:rFonts w:hint="eastAsia"/>
-          <w:lang w:val="en-US" w:eastAsia="zh-CN"/>
-        </w:rPr>
-        <w:t>(6)</w:t>
-      </w:r>
-      <w:r>
-        <w:rPr>
-          <w:rFonts w:hint="default"/>
-          <w:lang w:val="en-US" w:eastAsia="zh-CN"/>
-        </w:rPr>
-        <w:t>: The base station can adapt to multiple protocols. Users can choose themselves</w:t>
-      </w:r>
-    </w:p>
-    <w:p>
-      <w:pPr>
-        <w:rPr>
-          <w:rFonts w:hint="default"/>
-          <w:lang w:val="en-US" w:eastAsia="zh-CN"/>
-        </w:rPr>
-      </w:pPr>
-      <w:r>
-        <w:rPr>
-          <w:rFonts w:hint="default"/>
-          <w:lang w:val="en-US" w:eastAsia="zh-CN"/>
-        </w:rPr>
-        <w:t>[Filter Parameters]</w:t>
-      </w:r>
-    </w:p>
-    <w:p>
-      <w:pPr>
-        <w:rPr>
-          <w:rFonts w:hint="default"/>
-          <w:lang w:val="en-US" w:eastAsia="zh-CN"/>
-        </w:rPr>
-      </w:pPr>
-      <w:r>
-        <w:rPr>
-          <w:rFonts w:hint="default"/>
-          <w:lang w:val="en-US" w:eastAsia="zh-CN"/>
-        </w:rPr>
-        <w:t>Filter Coefficient</w:t>
-      </w:r>
-      <w:r>
-        <w:rPr>
-          <w:rFonts w:hint="eastAsia"/>
-          <w:lang w:val="en-US" w:eastAsia="zh-CN"/>
-        </w:rPr>
-        <w:t>(7)</w:t>
-      </w:r>
-      <w:r>
-        <w:rPr>
-          <w:rFonts w:hint="default"/>
-          <w:lang w:val="en-US" w:eastAsia="zh-CN"/>
-        </w:rPr>
-        <w:t>: The larger the coefficient, the smoother the angle. Recommended value (10-20)</w:t>
-      </w:r>
-    </w:p>
-    <w:p>
-      <w:pPr>
-        <w:rPr>
-          <w:rFonts w:hint="default"/>
-          <w:lang w:val="en-US" w:eastAsia="zh-CN"/>
-        </w:rPr>
-      </w:pPr>
-      <w:r>
-        <w:rPr>
-          <w:rFonts w:hint="default"/>
-          <w:lang w:val="en-US" w:eastAsia="zh-CN"/>
-        </w:rPr>
-        <w:t>Base Station Enable Hardware Filtering</w:t>
-      </w:r>
-      <w:r>
-        <w:rPr>
-          <w:rFonts w:hint="eastAsia"/>
-          <w:lang w:val="en-US" w:eastAsia="zh-CN"/>
-        </w:rPr>
-        <w:t>(8)</w:t>
-      </w:r>
-      <w:r>
-        <w:rPr>
-          <w:rFonts w:hint="default"/>
-          <w:lang w:val="en-US" w:eastAsia="zh-CN"/>
-        </w:rPr>
-        <w:t>: Whether the hardware filtering is enabled</w:t>
-      </w:r>
-    </w:p>
-    <w:p>
-      <w:pPr>
-        <w:rPr>
-          <w:rFonts w:hint="default"/>
-          <w:lang w:val="en-US" w:eastAsia="zh-CN"/>
-        </w:rPr>
-      </w:pPr>
-      <w:r>
-        <w:rPr>
-          <w:rFonts w:hint="default"/>
-          <w:lang w:val="en-US" w:eastAsia="zh-CN"/>
-        </w:rPr>
-        <w:t>[Version Parameters]</w:t>
+    <w:p/>
+    <w:p>
+      <w:pPr>
+        <w:rPr>
+          <w:rFonts w:hint="eastAsia"/>
+          <w:lang w:val="en-US" w:eastAsia="zh-CN"/>
+        </w:rPr>
+      </w:pPr>
+      <w:r>
+        <w:rPr>
+          <w:rFonts w:hint="eastAsia"/>
+          <w:lang w:val="en-US" w:eastAsia="zh-CN"/>
+        </w:rPr>
+        <w:t>8</w:t>
       </w:r>
       <w:bookmarkStart w:id="0" w:name="_GoBack"/>
       <w:bookmarkEnd w:id="0"/>
-    </w:p>
-    <w:p>
-      <w:pPr>
-        <w:rPr>
-          <w:rFonts w:hint="default"/>
-          <w:lang w:val="en-US" w:eastAsia="zh-CN"/>
-        </w:rPr>
-      </w:pPr>
-      <w:r>
-        <w:rPr>
-          <w:rFonts w:hint="default"/>
-          <w:lang w:val="en-US" w:eastAsia="zh-CN"/>
-        </w:rPr>
-        <w:t>Software/Hardware Version</w:t>
-      </w:r>
-      <w:r>
-        <w:rPr>
-          <w:rFonts w:hint="eastAsia"/>
-          <w:lang w:val="en-US" w:eastAsia="zh-CN"/>
-        </w:rPr>
-        <w:t>(9)</w:t>
-      </w:r>
-      <w:r>
-        <w:rPr>
-          <w:rFonts w:hint="default"/>
-          <w:lang w:val="en-US" w:eastAsia="zh-CN"/>
-        </w:rPr>
-        <w:t>: Base station software version number</w:t>
-      </w:r>
-    </w:p>
-    <w:p>
-      <w:pPr>
-        <w:rPr>
-          <w:rFonts w:hint="default"/>
-          <w:lang w:val="en-US" w:eastAsia="zh-CN"/>
-        </w:rPr>
-      </w:pPr>
-    </w:p>
-    <w:p>
-      <w:pPr>
-        <w:rPr>
-          <w:rFonts w:hint="default"/>
-          <w:lang w:val="en-US" w:eastAsia="zh-CN"/>
-        </w:rPr>
-      </w:pPr>
-    </w:p>
-    <w:p>
-      <w:pPr>
-        <w:rPr>
-          <w:rFonts w:hint="default"/>
-          <w:lang w:val="en-US" w:eastAsia="zh-CN"/>
-        </w:rPr>
-      </w:pPr>
-      <w:r>
-        <w:rPr>
-          <w:rFonts w:hint="default"/>
-          <w:lang w:val="en-US" w:eastAsia="zh-CN"/>
-        </w:rPr>
-        <w:t>Read parameter instructions:</w:t>
-      </w:r>
-    </w:p>
-    <w:p>
-      <w:pPr>
-        <w:rPr>
-          <w:rFonts w:hint="default"/>
-          <w:lang w:val="en-US" w:eastAsia="zh-CN"/>
-        </w:rPr>
-      </w:pPr>
-      <w:r>
-        <w:rPr>
-          <w:rFonts w:hint="default"/>
-          <w:lang w:val="en-US" w:eastAsia="zh-CN"/>
-        </w:rPr>
-        <w:t>Step 1: Click on "Read All Parameters"</w:t>
-      </w:r>
-    </w:p>
-    <w:p>
-      <w:pPr>
-        <w:rPr>
-          <w:rFonts w:hint="default"/>
-          <w:lang w:val="en-US" w:eastAsia="zh-CN"/>
-        </w:rPr>
-      </w:pPr>
+      <w:r>
+        <w:rPr>
+          <w:rFonts w:hint="eastAsia"/>
+          <w:lang w:val="en-US" w:eastAsia="zh-CN"/>
+        </w:rPr>
+        <w:t>.</w:t>
+      </w:r>
+      <w:r>
+        <w:rPr>
+          <w:rFonts w:hint="default"/>
+          <w:lang w:val="en-US" w:eastAsia="zh-CN"/>
+        </w:rPr>
+        <w:t>Base station configuration</w:t>
+      </w:r>
+      <w:r>
+        <w:rPr>
+          <w:rFonts w:hint="eastAsia"/>
+          <w:lang w:val="en-US" w:eastAsia="zh-CN"/>
+        </w:rPr>
+        <w:t>.</w:t>
+      </w:r>
+    </w:p>
+    <w:p>
       <w:r>
         <w:drawing>
           <wp:inline distT="0" distB="0" distL="114300" distR="114300">
             <wp:extent cx="5265420" cy="5085080"/>
             <wp:effectExtent l="0" t="0" r="1905" b="1270"/>
-            <wp:docPr id="10" name="图片 7"/>
+            <wp:docPr id="9" name="图片 6"/>
             <wp:cNvGraphicFramePr>
               <a:graphicFrameLocks xmlns:a="http://schemas.openxmlformats.org/drawingml/2006/main" noChangeAspect="1"/>
             </wp:cNvGraphicFramePr>
@@ -1096,7 +789,7 @@
               <a:graphicData uri="http://schemas.openxmlformats.org/drawingml/2006/picture">
                 <pic:pic xmlns:pic="http://schemas.openxmlformats.org/drawingml/2006/picture">
                   <pic:nvPicPr>
-                    <pic:cNvPr id="10" name="图片 7"/>
+                    <pic:cNvPr id="9" name="图片 6"/>
                     <pic:cNvPicPr>
                       <a:picLocks noChangeAspect="1"/>
                     </pic:cNvPicPr>
@@ -1134,6 +827,424 @@
           <w:lang w:val="en-US" w:eastAsia="zh-CN"/>
         </w:rPr>
       </w:pPr>
+      <w:r>
+        <w:rPr>
+          <w:rFonts w:hint="default"/>
+          <w:lang w:val="en-US" w:eastAsia="zh-CN"/>
+        </w:rPr>
+        <w:t>Parameter Description:</w:t>
+      </w:r>
+    </w:p>
+    <w:p>
+      <w:pPr>
+        <w:rPr>
+          <w:rFonts w:hint="default"/>
+          <w:lang w:val="en-US" w:eastAsia="zh-CN"/>
+        </w:rPr>
+      </w:pPr>
+      <w:r>
+        <w:rPr>
+          <w:rFonts w:hint="default"/>
+          <w:lang w:val="en-US" w:eastAsia="zh-CN"/>
+        </w:rPr>
+        <w:t>[Device Parameters]</w:t>
+      </w:r>
+    </w:p>
+    <w:p>
+      <w:pPr>
+        <w:rPr>
+          <w:rFonts w:hint="default"/>
+          <w:lang w:val="en-US" w:eastAsia="zh-CN"/>
+        </w:rPr>
+      </w:pPr>
+      <w:r>
+        <w:rPr>
+          <w:rFonts w:hint="default"/>
+          <w:lang w:val="en-US" w:eastAsia="zh-CN"/>
+        </w:rPr>
+        <w:t>Base Station Network</w:t>
+      </w:r>
+      <w:r>
+        <w:rPr>
+          <w:rFonts w:hint="eastAsia"/>
+          <w:lang w:val="en-US" w:eastAsia="zh-CN"/>
+        </w:rPr>
+        <w:t>(1)</w:t>
+      </w:r>
+      <w:r>
+        <w:rPr>
+          <w:rFonts w:hint="default"/>
+          <w:lang w:val="en-US" w:eastAsia="zh-CN"/>
+        </w:rPr>
+        <w:t>: Network ID (This parameter can be used to set the network ID and the base station number ID to avoid interference between multiple sets)</w:t>
+      </w:r>
+    </w:p>
+    <w:p>
+      <w:pPr>
+        <w:rPr>
+          <w:rFonts w:hint="default"/>
+          <w:lang w:val="en-US" w:eastAsia="zh-CN"/>
+        </w:rPr>
+      </w:pPr>
+      <w:r>
+        <w:rPr>
+          <w:rFonts w:hint="default"/>
+          <w:lang w:val="en-US" w:eastAsia="zh-CN"/>
+        </w:rPr>
+        <w:t>Base Station Role</w:t>
+      </w:r>
+      <w:r>
+        <w:rPr>
+          <w:rFonts w:hint="eastAsia"/>
+          <w:lang w:val="en-US" w:eastAsia="zh-CN"/>
+        </w:rPr>
+        <w:t>(2)</w:t>
+      </w:r>
+      <w:r>
+        <w:rPr>
+          <w:rFonts w:hint="default"/>
+          <w:lang w:val="en-US" w:eastAsia="zh-CN"/>
+        </w:rPr>
+        <w:t>: Default</w:t>
+      </w:r>
+    </w:p>
+    <w:p>
+      <w:pPr>
+        <w:rPr>
+          <w:rFonts w:hint="default"/>
+          <w:lang w:val="en-US" w:eastAsia="zh-CN"/>
+        </w:rPr>
+      </w:pPr>
+      <w:r>
+        <w:rPr>
+          <w:rFonts w:hint="default"/>
+          <w:lang w:val="en-US" w:eastAsia="zh-CN"/>
+        </w:rPr>
+        <w:t>Base Station Number ID</w:t>
+      </w:r>
+      <w:r>
+        <w:rPr>
+          <w:rFonts w:hint="eastAsia"/>
+          <w:lang w:val="en-US" w:eastAsia="zh-CN"/>
+        </w:rPr>
+        <w:t>(3)</w:t>
+      </w:r>
+      <w:r>
+        <w:rPr>
+          <w:rFonts w:hint="default"/>
+          <w:lang w:val="en-US" w:eastAsia="zh-CN"/>
+        </w:rPr>
+        <w:t>: Tags within the same network ID can communicate with different base station number IDs. Each base station can obtain distance and angle</w:t>
+      </w:r>
+    </w:p>
+    <w:p>
+      <w:pPr>
+        <w:rPr>
+          <w:rFonts w:hint="default"/>
+          <w:lang w:val="en-US" w:eastAsia="zh-CN"/>
+        </w:rPr>
+      </w:pPr>
+      <w:r>
+        <w:rPr>
+          <w:rFonts w:hint="default"/>
+          <w:lang w:val="en-US" w:eastAsia="zh-CN"/>
+        </w:rPr>
+        <w:t>Number of Base Station Binding Tags</w:t>
+      </w:r>
+      <w:r>
+        <w:rPr>
+          <w:rFonts w:hint="eastAsia"/>
+          <w:lang w:val="en-US" w:eastAsia="zh-CN"/>
+        </w:rPr>
+        <w:t>(4)</w:t>
+      </w:r>
+      <w:r>
+        <w:rPr>
+          <w:rFonts w:hint="default"/>
+          <w:lang w:val="en-US" w:eastAsia="zh-CN"/>
+        </w:rPr>
+        <w:t>: Default</w:t>
+      </w:r>
+    </w:p>
+    <w:p>
+      <w:pPr>
+        <w:rPr>
+          <w:rFonts w:hint="default"/>
+          <w:lang w:val="en-US" w:eastAsia="zh-CN"/>
+        </w:rPr>
+      </w:pPr>
+      <w:r>
+        <w:rPr>
+          <w:rFonts w:hint="default"/>
+          <w:lang w:val="en-US" w:eastAsia="zh-CN"/>
+        </w:rPr>
+        <w:t>Base Station Single Cycle Duration (ms)</w:t>
+      </w:r>
+      <w:r>
+        <w:rPr>
+          <w:rFonts w:hint="eastAsia"/>
+          <w:lang w:val="en-US" w:eastAsia="zh-CN"/>
+        </w:rPr>
+        <w:t>(5)</w:t>
+      </w:r>
+      <w:r>
+        <w:rPr>
+          <w:rFonts w:hint="default"/>
+          <w:lang w:val="en-US" w:eastAsia="zh-CN"/>
+        </w:rPr>
+        <w:t>: The duration of communication between the tag and the base station</w:t>
+      </w:r>
+    </w:p>
+    <w:p>
+      <w:pPr>
+        <w:rPr>
+          <w:rFonts w:hint="default"/>
+          <w:lang w:val="en-US" w:eastAsia="zh-CN"/>
+        </w:rPr>
+      </w:pPr>
+      <w:r>
+        <w:rPr>
+          <w:rFonts w:hint="default"/>
+          <w:lang w:val="en-US" w:eastAsia="zh-CN"/>
+        </w:rPr>
+        <w:t>Base Station Command Format</w:t>
+      </w:r>
+      <w:r>
+        <w:rPr>
+          <w:rFonts w:hint="eastAsia"/>
+          <w:lang w:val="en-US" w:eastAsia="zh-CN"/>
+        </w:rPr>
+        <w:t>(6)</w:t>
+      </w:r>
+      <w:r>
+        <w:rPr>
+          <w:rFonts w:hint="default"/>
+          <w:lang w:val="en-US" w:eastAsia="zh-CN"/>
+        </w:rPr>
+        <w:t>: The base station can adapt to multiple protocols. Users can choose themselves</w:t>
+      </w:r>
+    </w:p>
+    <w:p>
+      <w:pPr>
+        <w:rPr>
+          <w:rFonts w:hint="default"/>
+          <w:lang w:val="en-US" w:eastAsia="zh-CN"/>
+        </w:rPr>
+      </w:pPr>
+      <w:r>
+        <w:rPr>
+          <w:rFonts w:hint="default"/>
+          <w:lang w:val="en-US" w:eastAsia="zh-CN"/>
+        </w:rPr>
+        <w:t>[Filter Parameters]</w:t>
+      </w:r>
+    </w:p>
+    <w:p>
+      <w:pPr>
+        <w:rPr>
+          <w:rFonts w:hint="default"/>
+          <w:lang w:val="en-US" w:eastAsia="zh-CN"/>
+        </w:rPr>
+      </w:pPr>
+      <w:r>
+        <w:rPr>
+          <w:rFonts w:hint="default"/>
+          <w:lang w:val="en-US" w:eastAsia="zh-CN"/>
+        </w:rPr>
+        <w:t>Filter Coefficient</w:t>
+      </w:r>
+      <w:r>
+        <w:rPr>
+          <w:rFonts w:hint="eastAsia"/>
+          <w:lang w:val="en-US" w:eastAsia="zh-CN"/>
+        </w:rPr>
+        <w:t>(7)</w:t>
+      </w:r>
+      <w:r>
+        <w:rPr>
+          <w:rFonts w:hint="default"/>
+          <w:lang w:val="en-US" w:eastAsia="zh-CN"/>
+        </w:rPr>
+        <w:t>: The larger the coefficient, the smoother the angle. Recommended value (10-20)</w:t>
+      </w:r>
+    </w:p>
+    <w:p>
+      <w:pPr>
+        <w:rPr>
+          <w:rFonts w:hint="default"/>
+          <w:lang w:val="en-US" w:eastAsia="zh-CN"/>
+        </w:rPr>
+      </w:pPr>
+      <w:r>
+        <w:rPr>
+          <w:rFonts w:hint="default"/>
+          <w:lang w:val="en-US" w:eastAsia="zh-CN"/>
+        </w:rPr>
+        <w:t>Base Station Enable Hardware Filtering</w:t>
+      </w:r>
+      <w:r>
+        <w:rPr>
+          <w:rFonts w:hint="eastAsia"/>
+          <w:lang w:val="en-US" w:eastAsia="zh-CN"/>
+        </w:rPr>
+        <w:t>(8)</w:t>
+      </w:r>
+      <w:r>
+        <w:rPr>
+          <w:rFonts w:hint="default"/>
+          <w:lang w:val="en-US" w:eastAsia="zh-CN"/>
+        </w:rPr>
+        <w:t>: Whether the hardware filtering is enabled</w:t>
+      </w:r>
+    </w:p>
+    <w:p>
+      <w:pPr>
+        <w:rPr>
+          <w:rFonts w:hint="default"/>
+          <w:lang w:val="en-US" w:eastAsia="zh-CN"/>
+        </w:rPr>
+      </w:pPr>
+      <w:r>
+        <w:rPr>
+          <w:rFonts w:hint="default"/>
+          <w:lang w:val="en-US" w:eastAsia="zh-CN"/>
+        </w:rPr>
+        <w:t>[Version Parameters]</w:t>
+      </w:r>
+    </w:p>
+    <w:p>
+      <w:pPr>
+        <w:rPr>
+          <w:rFonts w:hint="default"/>
+          <w:lang w:val="en-US" w:eastAsia="zh-CN"/>
+        </w:rPr>
+      </w:pPr>
+      <w:r>
+        <w:rPr>
+          <w:rFonts w:hint="default"/>
+          <w:lang w:val="en-US" w:eastAsia="zh-CN"/>
+        </w:rPr>
+        <w:t>Software/Hardware Version</w:t>
+      </w:r>
+      <w:r>
+        <w:rPr>
+          <w:rFonts w:hint="eastAsia"/>
+          <w:lang w:val="en-US" w:eastAsia="zh-CN"/>
+        </w:rPr>
+        <w:t>(9)</w:t>
+      </w:r>
+      <w:r>
+        <w:rPr>
+          <w:rFonts w:hint="default"/>
+          <w:lang w:val="en-US" w:eastAsia="zh-CN"/>
+        </w:rPr>
+        <w:t>: Base station software version number</w:t>
+      </w:r>
+    </w:p>
+    <w:p>
+      <w:pPr>
+        <w:rPr>
+          <w:rFonts w:hint="default"/>
+          <w:lang w:val="en-US" w:eastAsia="zh-CN"/>
+        </w:rPr>
+      </w:pPr>
+    </w:p>
+    <w:p>
+      <w:pPr>
+        <w:rPr>
+          <w:rFonts w:hint="default"/>
+          <w:lang w:val="en-US" w:eastAsia="zh-CN"/>
+        </w:rPr>
+      </w:pPr>
+    </w:p>
+    <w:p>
+      <w:pPr>
+        <w:rPr>
+          <w:rFonts w:hint="default"/>
+          <w:lang w:val="en-US" w:eastAsia="zh-CN"/>
+        </w:rPr>
+      </w:pPr>
+      <w:r>
+        <w:rPr>
+          <w:rFonts w:hint="default"/>
+          <w:lang w:val="en-US" w:eastAsia="zh-CN"/>
+        </w:rPr>
+        <w:t>Read parameter instructions:</w:t>
+      </w:r>
+    </w:p>
+    <w:p>
+      <w:pPr>
+        <w:rPr>
+          <w:rFonts w:hint="default"/>
+          <w:lang w:val="en-US" w:eastAsia="zh-CN"/>
+        </w:rPr>
+      </w:pPr>
+      <w:r>
+        <w:rPr>
+          <w:rFonts w:hint="default"/>
+          <w:lang w:val="en-US" w:eastAsia="zh-CN"/>
+        </w:rPr>
+        <w:t>Step 1: Click on "Read All Parameters"</w:t>
+      </w:r>
+    </w:p>
+    <w:p>
+      <w:pPr>
+        <w:rPr>
+          <w:rFonts w:hint="default"/>
+          <w:lang w:val="en-US" w:eastAsia="zh-CN"/>
+        </w:rPr>
+      </w:pPr>
+      <w:r>
+        <w:drawing>
+          <wp:inline distT="0" distB="0" distL="114300" distR="114300">
+            <wp:extent cx="5265420" cy="5085080"/>
+            <wp:effectExtent l="0" t="0" r="1905" b="1270"/>
+            <wp:docPr id="10" name="图片 7"/>
+            <wp:cNvGraphicFramePr>
+              <a:graphicFrameLocks xmlns:a="http://schemas.openxmlformats.org/drawingml/2006/main" noChangeAspect="1"/>
+            </wp:cNvGraphicFramePr>
+            <a:graphic xmlns:a="http://schemas.openxmlformats.org/drawingml/2006/main">
+              <a:graphicData uri="http://schemas.openxmlformats.org/drawingml/2006/picture">
+                <pic:pic xmlns:pic="http://schemas.openxmlformats.org/drawingml/2006/picture">
+                  <pic:nvPicPr>
+                    <pic:cNvPr id="10" name="图片 7"/>
+                    <pic:cNvPicPr>
+                      <a:picLocks noChangeAspect="1"/>
+                    </pic:cNvPicPr>
+                  </pic:nvPicPr>
+                  <pic:blipFill>
+                    <a:blip r:embed="rId13"/>
+                    <a:stretch>
+                      <a:fillRect/>
+                    </a:stretch>
+                  </pic:blipFill>
+                  <pic:spPr>
+                    <a:xfrm>
+                      <a:off x="0" y="0"/>
+                      <a:ext cx="5265420" cy="5085080"/>
+                    </a:xfrm>
+                    <a:prstGeom prst="rect">
+                      <a:avLst/>
+                    </a:prstGeom>
+                    <a:noFill/>
+                    <a:ln>
+                      <a:noFill/>
+                    </a:ln>
+                  </pic:spPr>
+                </pic:pic>
+              </a:graphicData>
+            </a:graphic>
+          </wp:inline>
+        </w:drawing>
+      </w:r>
+    </w:p>
+    <w:p>
+      <w:pPr>
+        <w:rPr>
+          <w:rFonts w:hint="default"/>
+          <w:lang w:val="en-US" w:eastAsia="zh-CN"/>
+        </w:rPr>
+      </w:pPr>
     </w:p>
     <w:p>
       <w:pPr>
@@ -1252,7 +1363,7 @@
                     </pic:cNvPicPr>
                   </pic:nvPicPr>
                   <pic:blipFill>
-                    <a:blip r:embed="rId13"/>
+                    <a:blip r:embed="rId14"/>
                     <a:stretch>
                       <a:fillRect/>
                     </a:stretch>

</xml_diff>